<commit_message>
Add application screenshots to project report and plots/screenshots folder
</commit_message>
<xml_diff>
--- a/SouraneelBiswas_ProjectReport.docx
+++ b/SouraneelBiswas_ProjectReport.docx
@@ -539,12 +539,12 @@
       <w:tblPr>
         <w:tblW w:w="5000" w:type="pct"/>
         <w:tblBorders>
-          <w:top w:val="single" w:sz="4" w:space="0" w:color="auto"/>
-          <w:left w:val="single" w:sz="4" w:space="0" w:color="auto"/>
-          <w:bottom w:val="single" w:sz="4" w:space="0" w:color="auto"/>
-          <w:right w:val="single" w:sz="4" w:space="0" w:color="auto"/>
-          <w:insideH w:val="single" w:sz="4" w:space="0" w:color="auto"/>
-          <w:insideV w:val="single" w:sz="4" w:space="0" w:color="auto"/>
+          <w:top w:val="single" w:color="auto" w:sz="4" w:space="0"/>
+          <w:left w:val="single" w:color="auto" w:sz="4" w:space="0"/>
+          <w:bottom w:val="single" w:color="auto" w:sz="4" w:space="0"/>
+          <w:right w:val="single" w:color="auto" w:sz="4" w:space="0"/>
+          <w:insideH w:val="single" w:color="auto" w:sz="4" w:space="0"/>
+          <w:insideV w:val="single" w:color="auto" w:sz="4" w:space="0"/>
         </w:tblBorders>
         <w:tblCellMar>
           <w:left w:w="10" w:type="dxa"/>
@@ -940,12 +940,12 @@
       <w:tblPr>
         <w:tblW w:w="5000" w:type="pct"/>
         <w:tblBorders>
-          <w:top w:val="single" w:sz="4" w:space="0" w:color="auto"/>
-          <w:left w:val="single" w:sz="4" w:space="0" w:color="auto"/>
-          <w:bottom w:val="single" w:sz="4" w:space="0" w:color="auto"/>
-          <w:right w:val="single" w:sz="4" w:space="0" w:color="auto"/>
-          <w:insideH w:val="single" w:sz="4" w:space="0" w:color="auto"/>
-          <w:insideV w:val="single" w:sz="4" w:space="0" w:color="auto"/>
+          <w:top w:val="single" w:color="auto" w:sz="4" w:space="0"/>
+          <w:left w:val="single" w:color="auto" w:sz="4" w:space="0"/>
+          <w:bottom w:val="single" w:color="auto" w:sz="4" w:space="0"/>
+          <w:right w:val="single" w:color="auto" w:sz="4" w:space="0"/>
+          <w:insideH w:val="single" w:color="auto" w:sz="4" w:space="0"/>
+          <w:insideV w:val="single" w:color="auto" w:sz="4" w:space="0"/>
         </w:tblBorders>
         <w:tblCellMar>
           <w:left w:w="10" w:type="dxa"/>
@@ -1441,12 +1441,12 @@
       <w:tblPr>
         <w:tblW w:w="5000" w:type="pct"/>
         <w:tblBorders>
-          <w:top w:val="single" w:sz="4" w:space="0" w:color="auto"/>
-          <w:left w:val="single" w:sz="4" w:space="0" w:color="auto"/>
-          <w:bottom w:val="single" w:sz="4" w:space="0" w:color="auto"/>
-          <w:right w:val="single" w:sz="4" w:space="0" w:color="auto"/>
-          <w:insideH w:val="single" w:sz="4" w:space="0" w:color="auto"/>
-          <w:insideV w:val="single" w:sz="4" w:space="0" w:color="auto"/>
+          <w:top w:val="single" w:color="auto" w:sz="4" w:space="0"/>
+          <w:left w:val="single" w:color="auto" w:sz="4" w:space="0"/>
+          <w:bottom w:val="single" w:color="auto" w:sz="4" w:space="0"/>
+          <w:right w:val="single" w:color="auto" w:sz="4" w:space="0"/>
+          <w:insideH w:val="single" w:color="auto" w:sz="4" w:space="0"/>
+          <w:insideV w:val="single" w:color="auto" w:sz="4" w:space="0"/>
         </w:tblBorders>
         <w:tblCellMar>
           <w:left w:w="10" w:type="dxa"/>
@@ -1715,12 +1715,12 @@
       <w:tblPr>
         <w:tblW w:w="5000" w:type="pct"/>
         <w:tblBorders>
-          <w:top w:val="single" w:sz="4" w:space="0" w:color="auto"/>
-          <w:left w:val="single" w:sz="4" w:space="0" w:color="auto"/>
-          <w:bottom w:val="single" w:sz="4" w:space="0" w:color="auto"/>
-          <w:right w:val="single" w:sz="4" w:space="0" w:color="auto"/>
-          <w:insideH w:val="single" w:sz="4" w:space="0" w:color="auto"/>
-          <w:insideV w:val="single" w:sz="4" w:space="0" w:color="auto"/>
+          <w:top w:val="single" w:color="auto" w:sz="4" w:space="0"/>
+          <w:left w:val="single" w:color="auto" w:sz="4" w:space="0"/>
+          <w:bottom w:val="single" w:color="auto" w:sz="4" w:space="0"/>
+          <w:right w:val="single" w:color="auto" w:sz="4" w:space="0"/>
+          <w:insideH w:val="single" w:color="auto" w:sz="4" w:space="0"/>
+          <w:insideV w:val="single" w:color="auto" w:sz="4" w:space="0"/>
         </w:tblBorders>
         <w:tblCellMar>
           <w:left w:w="10" w:type="dxa"/>
@@ -2186,12 +2186,12 @@
       <w:tblPr>
         <w:tblW w:w="5000" w:type="pct"/>
         <w:tblBorders>
-          <w:top w:val="single" w:sz="4" w:space="0" w:color="auto"/>
-          <w:left w:val="single" w:sz="4" w:space="0" w:color="auto"/>
-          <w:bottom w:val="single" w:sz="4" w:space="0" w:color="auto"/>
-          <w:right w:val="single" w:sz="4" w:space="0" w:color="auto"/>
-          <w:insideH w:val="single" w:sz="4" w:space="0" w:color="auto"/>
-          <w:insideV w:val="single" w:sz="4" w:space="0" w:color="auto"/>
+          <w:top w:val="single" w:color="auto" w:sz="4" w:space="0"/>
+          <w:left w:val="single" w:color="auto" w:sz="4" w:space="0"/>
+          <w:bottom w:val="single" w:color="auto" w:sz="4" w:space="0"/>
+          <w:right w:val="single" w:color="auto" w:sz="4" w:space="0"/>
+          <w:insideH w:val="single" w:color="auto" w:sz="4" w:space="0"/>
+          <w:insideV w:val="single" w:color="auto" w:sz="4" w:space="0"/>
         </w:tblBorders>
         <w:tblCellMar>
           <w:left w:w="10" w:type="dxa"/>
@@ -2465,12 +2465,12 @@
       <w:tblPr>
         <w:tblW w:w="5000" w:type="pct"/>
         <w:tblBorders>
-          <w:top w:val="single" w:sz="4" w:space="0" w:color="auto"/>
-          <w:left w:val="single" w:sz="4" w:space="0" w:color="auto"/>
-          <w:bottom w:val="single" w:sz="4" w:space="0" w:color="auto"/>
-          <w:right w:val="single" w:sz="4" w:space="0" w:color="auto"/>
-          <w:insideH w:val="single" w:sz="4" w:space="0" w:color="auto"/>
-          <w:insideV w:val="single" w:sz="4" w:space="0" w:color="auto"/>
+          <w:top w:val="single" w:color="auto" w:sz="4" w:space="0"/>
+          <w:left w:val="single" w:color="auto" w:sz="4" w:space="0"/>
+          <w:bottom w:val="single" w:color="auto" w:sz="4" w:space="0"/>
+          <w:right w:val="single" w:color="auto" w:sz="4" w:space="0"/>
+          <w:insideH w:val="single" w:color="auto" w:sz="4" w:space="0"/>
+          <w:insideV w:val="single" w:color="auto" w:sz="4" w:space="0"/>
         </w:tblBorders>
         <w:tblCellMar>
           <w:left w:w="10" w:type="dxa"/>
@@ -2964,12 +2964,12 @@
       <w:tblPr>
         <w:tblW w:w="5000" w:type="pct"/>
         <w:tblBorders>
-          <w:top w:val="single" w:sz="4" w:space="0" w:color="auto"/>
-          <w:left w:val="single" w:sz="4" w:space="0" w:color="auto"/>
-          <w:bottom w:val="single" w:sz="4" w:space="0" w:color="auto"/>
-          <w:right w:val="single" w:sz="4" w:space="0" w:color="auto"/>
-          <w:insideH w:val="single" w:sz="4" w:space="0" w:color="auto"/>
-          <w:insideV w:val="single" w:sz="4" w:space="0" w:color="auto"/>
+          <w:top w:val="single" w:color="auto" w:sz="4" w:space="0"/>
+          <w:left w:val="single" w:color="auto" w:sz="4" w:space="0"/>
+          <w:bottom w:val="single" w:color="auto" w:sz="4" w:space="0"/>
+          <w:right w:val="single" w:color="auto" w:sz="4" w:space="0"/>
+          <w:insideH w:val="single" w:color="auto" w:sz="4" w:space="0"/>
+          <w:insideV w:val="single" w:color="auto" w:sz="4" w:space="0"/>
         </w:tblBorders>
         <w:tblCellMar>
           <w:left w:w="10" w:type="dxa"/>
@@ -3154,12 +3154,12 @@
       <w:tblPr>
         <w:tblW w:w="5000" w:type="pct"/>
         <w:tblBorders>
-          <w:top w:val="single" w:sz="4" w:space="0" w:color="auto"/>
-          <w:left w:val="single" w:sz="4" w:space="0" w:color="auto"/>
-          <w:bottom w:val="single" w:sz="4" w:space="0" w:color="auto"/>
-          <w:right w:val="single" w:sz="4" w:space="0" w:color="auto"/>
-          <w:insideH w:val="single" w:sz="4" w:space="0" w:color="auto"/>
-          <w:insideV w:val="single" w:sz="4" w:space="0" w:color="auto"/>
+          <w:top w:val="single" w:color="auto" w:sz="4" w:space="0"/>
+          <w:left w:val="single" w:color="auto" w:sz="4" w:space="0"/>
+          <w:bottom w:val="single" w:color="auto" w:sz="4" w:space="0"/>
+          <w:right w:val="single" w:color="auto" w:sz="4" w:space="0"/>
+          <w:insideH w:val="single" w:color="auto" w:sz="4" w:space="0"/>
+          <w:insideV w:val="single" w:color="auto" w:sz="4" w:space="0"/>
         </w:tblBorders>
         <w:tblCellMar>
           <w:left w:w="10" w:type="dxa"/>
@@ -3393,12 +3393,12 @@
       <w:tblPr>
         <w:tblW w:w="5000" w:type="pct"/>
         <w:tblBorders>
-          <w:top w:val="single" w:sz="4" w:space="0" w:color="auto"/>
-          <w:left w:val="single" w:sz="4" w:space="0" w:color="auto"/>
-          <w:bottom w:val="single" w:sz="4" w:space="0" w:color="auto"/>
-          <w:right w:val="single" w:sz="4" w:space="0" w:color="auto"/>
-          <w:insideH w:val="single" w:sz="4" w:space="0" w:color="auto"/>
-          <w:insideV w:val="single" w:sz="4" w:space="0" w:color="auto"/>
+          <w:top w:val="single" w:color="auto" w:sz="4" w:space="0"/>
+          <w:left w:val="single" w:color="auto" w:sz="4" w:space="0"/>
+          <w:bottom w:val="single" w:color="auto" w:sz="4" w:space="0"/>
+          <w:right w:val="single" w:color="auto" w:sz="4" w:space="0"/>
+          <w:insideH w:val="single" w:color="auto" w:sz="4" w:space="0"/>
+          <w:insideV w:val="single" w:color="auto" w:sz="4" w:space="0"/>
         </w:tblBorders>
         <w:tblCellMar>
           <w:left w:w="10" w:type="dxa"/>
@@ -3720,12 +3720,12 @@
       <w:tblPr>
         <w:tblW w:w="5000" w:type="pct"/>
         <w:tblBorders>
-          <w:top w:val="single" w:sz="4" w:space="0" w:color="auto"/>
-          <w:left w:val="single" w:sz="4" w:space="0" w:color="auto"/>
-          <w:bottom w:val="single" w:sz="4" w:space="0" w:color="auto"/>
-          <w:right w:val="single" w:sz="4" w:space="0" w:color="auto"/>
-          <w:insideH w:val="single" w:sz="4" w:space="0" w:color="auto"/>
-          <w:insideV w:val="single" w:sz="4" w:space="0" w:color="auto"/>
+          <w:top w:val="single" w:color="auto" w:sz="4" w:space="0"/>
+          <w:left w:val="single" w:color="auto" w:sz="4" w:space="0"/>
+          <w:bottom w:val="single" w:color="auto" w:sz="4" w:space="0"/>
+          <w:right w:val="single" w:color="auto" w:sz="4" w:space="0"/>
+          <w:insideH w:val="single" w:color="auto" w:sz="4" w:space="0"/>
+          <w:insideV w:val="single" w:color="auto" w:sz="4" w:space="0"/>
         </w:tblBorders>
         <w:tblCellMar>
           <w:left w:w="10" w:type="dxa"/>
@@ -3918,12 +3918,12 @@
       <w:tblPr>
         <w:tblW w:w="5000" w:type="pct"/>
         <w:tblBorders>
-          <w:top w:val="single" w:sz="4" w:space="0" w:color="auto"/>
-          <w:left w:val="single" w:sz="4" w:space="0" w:color="auto"/>
-          <w:bottom w:val="single" w:sz="4" w:space="0" w:color="auto"/>
-          <w:right w:val="single" w:sz="4" w:space="0" w:color="auto"/>
-          <w:insideH w:val="single" w:sz="4" w:space="0" w:color="auto"/>
-          <w:insideV w:val="single" w:sz="4" w:space="0" w:color="auto"/>
+          <w:top w:val="single" w:color="auto" w:sz="4" w:space="0"/>
+          <w:left w:val="single" w:color="auto" w:sz="4" w:space="0"/>
+          <w:bottom w:val="single" w:color="auto" w:sz="4" w:space="0"/>
+          <w:right w:val="single" w:color="auto" w:sz="4" w:space="0"/>
+          <w:insideH w:val="single" w:color="auto" w:sz="4" w:space="0"/>
+          <w:insideV w:val="single" w:color="auto" w:sz="4" w:space="0"/>
         </w:tblBorders>
         <w:tblCellMar>
           <w:left w:w="10" w:type="dxa"/>
@@ -4270,6 +4270,62 @@
     </w:p>
     <w:p>
       <w:pPr>
+        <w:spacing w:after="240"/>
+        <w:jc w:val="center"/>
+      </w:pPr>
+      <w:r>
+        <w:rPr>
+          <w:color w:val="555555"/>
+          <w:sz w:val="20"/>
+        </w:rPr>
+        <w:t xml:space="preserve">Figure 1: FastAPI Swagger UI (http://localhost:8000/docs) showing all three endpoints — GET /, GET /model-info, and POST /predict — with request/response schemas.</w:t>
+      </w:r>
+    </w:p>
+    <w:p>
+      <w:pPr>
+        <w:spacing w:line="240" w:lineRule="auto"/>
+      </w:pPr>
+      <w:r>
+        <w:rPr/>
+        <w:drawing>
+          <wp:inline distT="0" distB="0" distL="0" distR="0">
+            <wp:extent cx="5400000" cy="3471428"/>
+            <wp:effectExtent l="0" t="0" r="0" b="0"/>
+            <wp:docPr id="1" name="05_fastapi_swagger.png" descr=""/>
+            <wp:cNvGraphicFramePr>
+              <a:graphicFrameLocks xmlns:a="http://schemas.openxmlformats.org/drawingml/2006/main" noChangeAspect="1"/>
+            </wp:cNvGraphicFramePr>
+            <a:graphic xmlns:a="http://schemas.openxmlformats.org/drawingml/2006/main">
+              <a:graphicData uri="http://schemas.openxmlformats.org/drawingml/2006/picture">
+                <pic:pic xmlns:pic="http://schemas.openxmlformats.org/drawingml/2006/picture">
+                  <pic:nvPicPr>
+                    <pic:cNvPr id="1" name="05_fastapi_swagger.png"/>
+                    <pic:cNvPicPr/>
+                  </pic:nvPicPr>
+                  <pic:blipFill>
+                    <a:blip r:embed="Rf5a5140efe0f4e2d" cstate="print"/>
+                    <a:stretch>
+                      <a:fillRect/>
+                    </a:stretch>
+                  </pic:blipFill>
+                  <pic:spPr>
+                    <a:xfrm>
+                      <a:off x="0" y="0"/>
+                      <a:ext cx="5400000" cy="3471428"/>
+                    </a:xfrm>
+                    <a:prstGeom prst="rect">
+                      <a:avLst/>
+                    </a:prstGeom>
+                  </pic:spPr>
+                </pic:pic>
+              </a:graphicData>
+            </a:graphic>
+          </wp:inline>
+        </w:drawing>
+      </w:r>
+    </w:p>
+    <w:p>
+      <w:pPr>
         <w:spacing w:before="240" w:after="120"/>
       </w:pPr>
       <w:r>
@@ -4286,6 +4342,62 @@
       </w:pPr>
       <w:r>
         <w:t>The frontend (frontend.py) is a Streamlit application that communicates with the FastAPI backend via the requests library. It is structured around three tabs: Prediction, Model Metrics, and Data Explorer.</w:t>
+      </w:r>
+    </w:p>
+    <w:p>
+      <w:pPr>
+        <w:spacing w:after="240"/>
+        <w:jc w:val="center"/>
+      </w:pPr>
+      <w:r>
+        <w:rPr>
+          <w:color w:val="555555"/>
+          <w:sz w:val="20"/>
+        </w:rPr>
+        <w:t xml:space="preserve">Figure 2: Streamlit frontend — Prediction tab (default state) showing the sidebar input controls and Dataset Feature Ranges cards.</w:t>
+      </w:r>
+    </w:p>
+    <w:p>
+      <w:pPr>
+        <w:spacing w:line="240" w:lineRule="auto"/>
+      </w:pPr>
+      <w:r>
+        <w:rPr/>
+        <w:drawing>
+          <wp:inline distT="0" distB="0" distL="0" distR="0">
+            <wp:extent cx="5400000" cy="3471428"/>
+            <wp:effectExtent l="0" t="0" r="0" b="0"/>
+            <wp:docPr id="2" name="01_prediction_tab_default.png" descr=""/>
+            <wp:cNvGraphicFramePr>
+              <a:graphicFrameLocks xmlns:a="http://schemas.openxmlformats.org/drawingml/2006/main" noChangeAspect="1"/>
+            </wp:cNvGraphicFramePr>
+            <a:graphic xmlns:a="http://schemas.openxmlformats.org/drawingml/2006/main">
+              <a:graphicData uri="http://schemas.openxmlformats.org/drawingml/2006/picture">
+                <pic:pic xmlns:pic="http://schemas.openxmlformats.org/drawingml/2006/picture">
+                  <pic:nvPicPr>
+                    <pic:cNvPr id="2" name="01_prediction_tab_default.png"/>
+                    <pic:cNvPicPr/>
+                  </pic:nvPicPr>
+                  <pic:blipFill>
+                    <a:blip r:embed="R95f0c237ef3b4465" cstate="print"/>
+                    <a:stretch>
+                      <a:fillRect/>
+                    </a:stretch>
+                  </pic:blipFill>
+                  <pic:spPr>
+                    <a:xfrm>
+                      <a:off x="0" y="0"/>
+                      <a:ext cx="5400000" cy="3471428"/>
+                    </a:xfrm>
+                    <a:prstGeom prst="rect">
+                      <a:avLst/>
+                    </a:prstGeom>
+                  </pic:spPr>
+                </pic:pic>
+              </a:graphicData>
+            </a:graphic>
+          </wp:inline>
+        </w:drawing>
       </w:r>
     </w:p>
     <w:p>
@@ -4312,12 +4424,12 @@
       <w:tblPr>
         <w:tblW w:w="5000" w:type="pct"/>
         <w:tblBorders>
-          <w:top w:val="single" w:sz="4" w:space="0" w:color="auto"/>
-          <w:left w:val="single" w:sz="4" w:space="0" w:color="auto"/>
-          <w:bottom w:val="single" w:sz="4" w:space="0" w:color="auto"/>
-          <w:right w:val="single" w:sz="4" w:space="0" w:color="auto"/>
-          <w:insideH w:val="single" w:sz="4" w:space="0" w:color="auto"/>
-          <w:insideV w:val="single" w:sz="4" w:space="0" w:color="auto"/>
+          <w:top w:val="single" w:color="auto" w:sz="4" w:space="0"/>
+          <w:left w:val="single" w:color="auto" w:sz="4" w:space="0"/>
+          <w:bottom w:val="single" w:color="auto" w:sz="4" w:space="0"/>
+          <w:right w:val="single" w:color="auto" w:sz="4" w:space="0"/>
+          <w:insideH w:val="single" w:color="auto" w:sz="4" w:space="0"/>
+          <w:insideV w:val="single" w:color="auto" w:sz="4" w:space="0"/>
         </w:tblBorders>
         <w:tblCellMar>
           <w:left w:w="10" w:type="dxa"/>
@@ -4684,6 +4796,62 @@
     </w:p>
     <w:p>
       <w:pPr>
+        <w:spacing w:after="240"/>
+        <w:jc w:val="center"/>
+      </w:pPr>
+      <w:r>
+        <w:rPr>
+          <w:color w:val="555555"/>
+          <w:sz w:val="20"/>
+        </w:rPr>
+        <w:t xml:space="preserve">Figure 3: Prediction tab after clicking Predict Price — showing estimated price ($458,118), model name (LinearRegression), and Input Summary metrics.</w:t>
+      </w:r>
+    </w:p>
+    <w:p>
+      <w:pPr>
+        <w:spacing w:line="240" w:lineRule="auto"/>
+      </w:pPr>
+      <w:r>
+        <w:rPr/>
+        <w:drawing>
+          <wp:inline distT="0" distB="0" distL="0" distR="0">
+            <wp:extent cx="5400000" cy="3471428"/>
+            <wp:effectExtent l="0" t="0" r="0" b="0"/>
+            <wp:docPr id="3" name="02_prediction_result.png" descr=""/>
+            <wp:cNvGraphicFramePr>
+              <a:graphicFrameLocks xmlns:a="http://schemas.openxmlformats.org/drawingml/2006/main" noChangeAspect="1"/>
+            </wp:cNvGraphicFramePr>
+            <a:graphic xmlns:a="http://schemas.openxmlformats.org/drawingml/2006/main">
+              <a:graphicData uri="http://schemas.openxmlformats.org/drawingml/2006/picture">
+                <pic:pic xmlns:pic="http://schemas.openxmlformats.org/drawingml/2006/picture">
+                  <pic:nvPicPr>
+                    <pic:cNvPr id="3" name="02_prediction_result.png"/>
+                    <pic:cNvPicPr/>
+                  </pic:nvPicPr>
+                  <pic:blipFill>
+                    <a:blip r:embed="R2192bf7c6c2b493f" cstate="print"/>
+                    <a:stretch>
+                      <a:fillRect/>
+                    </a:stretch>
+                  </pic:blipFill>
+                  <pic:spPr>
+                    <a:xfrm>
+                      <a:off x="0" y="0"/>
+                      <a:ext cx="5400000" cy="3471428"/>
+                    </a:xfrm>
+                    <a:prstGeom prst="rect">
+                      <a:avLst/>
+                    </a:prstGeom>
+                  </pic:spPr>
+                </pic:pic>
+              </a:graphicData>
+            </a:graphic>
+          </wp:inline>
+        </w:drawing>
+      </w:r>
+    </w:p>
+    <w:p>
+      <w:pPr>
         <w:spacing w:before="160" w:after="80"/>
       </w:pPr>
       <w:r>
@@ -4728,6 +4896,62 @@
     </w:p>
     <w:p>
       <w:pPr>
+        <w:spacing w:after="240"/>
+        <w:jc w:val="center"/>
+      </w:pPr>
+      <w:r>
+        <w:rPr>
+          <w:color w:val="555555"/>
+          <w:sz w:val="20"/>
+        </w:rPr>
+        <w:t xml:space="preserve">Figure 4: Model Metrics tab — model comparison table (LinearRegression highlighted as best), R² bar chart, and MAE vs RMSE grouped bar chart.</w:t>
+      </w:r>
+    </w:p>
+    <w:p>
+      <w:pPr>
+        <w:spacing w:line="240" w:lineRule="auto"/>
+      </w:pPr>
+      <w:r>
+        <w:rPr/>
+        <w:drawing>
+          <wp:inline distT="0" distB="0" distL="0" distR="0">
+            <wp:extent cx="5400000" cy="3471428"/>
+            <wp:effectExtent l="0" t="0" r="0" b="0"/>
+            <wp:docPr id="4" name="03_model_metrics_tab.png" descr=""/>
+            <wp:cNvGraphicFramePr>
+              <a:graphicFrameLocks xmlns:a="http://schemas.openxmlformats.org/drawingml/2006/main" noChangeAspect="1"/>
+            </wp:cNvGraphicFramePr>
+            <a:graphic xmlns:a="http://schemas.openxmlformats.org/drawingml/2006/main">
+              <a:graphicData uri="http://schemas.openxmlformats.org/drawingml/2006/picture">
+                <pic:pic xmlns:pic="http://schemas.openxmlformats.org/drawingml/2006/picture">
+                  <pic:nvPicPr>
+                    <pic:cNvPr id="4" name="03_model_metrics_tab.png"/>
+                    <pic:cNvPicPr/>
+                  </pic:nvPicPr>
+                  <pic:blipFill>
+                    <a:blip r:embed="R55e9d1e79bda4663" cstate="print"/>
+                    <a:stretch>
+                      <a:fillRect/>
+                    </a:stretch>
+                  </pic:blipFill>
+                  <pic:spPr>
+                    <a:xfrm>
+                      <a:off x="0" y="0"/>
+                      <a:ext cx="5400000" cy="3471428"/>
+                    </a:xfrm>
+                    <a:prstGeom prst="rect">
+                      <a:avLst/>
+                    </a:prstGeom>
+                  </pic:spPr>
+                </pic:pic>
+              </a:graphicData>
+            </a:graphic>
+          </wp:inline>
+        </w:drawing>
+      </w:r>
+    </w:p>
+    <w:p>
+      <w:pPr>
         <w:spacing w:before="160" w:after="80"/>
       </w:pPr>
       <w:r>
@@ -4768,6 +4992,62 @@
       </w:pPr>
       <w:r>
         <w:t>• Raw data expander showing the first 100 rows of the CSV.</w:t>
+      </w:r>
+    </w:p>
+    <w:p>
+      <w:pPr>
+        <w:spacing w:after="240"/>
+        <w:jc w:val="center"/>
+      </w:pPr>
+      <w:r>
+        <w:rPr>
+          <w:color w:val="555555"/>
+          <w:sz w:val="20"/>
+        </w:rPr>
+        <w:t xml:space="preserve">Figure 5: Data Explorer tab — scatter plot of Square Footage vs House Price (coloured by Neighbourhood Quality) and Price Distribution histogram.</w:t>
+      </w:r>
+    </w:p>
+    <w:p>
+      <w:pPr>
+        <w:spacing w:line="240" w:lineRule="auto"/>
+      </w:pPr>
+      <w:r>
+        <w:rPr/>
+        <w:drawing>
+          <wp:inline distT="0" distB="0" distL="0" distR="0">
+            <wp:extent cx="5400000" cy="3471428"/>
+            <wp:effectExtent l="0" t="0" r="0" b="0"/>
+            <wp:docPr id="5" name="04_data_explorer_tab.png" descr=""/>
+            <wp:cNvGraphicFramePr>
+              <a:graphicFrameLocks xmlns:a="http://schemas.openxmlformats.org/drawingml/2006/main" noChangeAspect="1"/>
+            </wp:cNvGraphicFramePr>
+            <a:graphic xmlns:a="http://schemas.openxmlformats.org/drawingml/2006/main">
+              <a:graphicData uri="http://schemas.openxmlformats.org/drawingml/2006/picture">
+                <pic:pic xmlns:pic="http://schemas.openxmlformats.org/drawingml/2006/picture">
+                  <pic:nvPicPr>
+                    <pic:cNvPr id="5" name="04_data_explorer_tab.png"/>
+                    <pic:cNvPicPr/>
+                  </pic:nvPicPr>
+                  <pic:blipFill>
+                    <a:blip r:embed="R0c98d2a22d57403a" cstate="print"/>
+                    <a:stretch>
+                      <a:fillRect/>
+                    </a:stretch>
+                  </pic:blipFill>
+                  <pic:spPr>
+                    <a:xfrm>
+                      <a:off x="0" y="0"/>
+                      <a:ext cx="5400000" cy="3471428"/>
+                    </a:xfrm>
+                    <a:prstGeom prst="rect">
+                      <a:avLst/>
+                    </a:prstGeom>
+                  </pic:spPr>
+                </pic:pic>
+              </a:graphicData>
+            </a:graphic>
+          </wp:inline>
+        </w:drawing>
       </w:r>
     </w:p>
     <w:p>
@@ -4794,12 +5074,12 @@
       <w:tblPr>
         <w:tblW w:w="5000" w:type="pct"/>
         <w:tblBorders>
-          <w:top w:val="single" w:sz="4" w:space="0" w:color="auto"/>
-          <w:left w:val="single" w:sz="4" w:space="0" w:color="auto"/>
-          <w:bottom w:val="single" w:sz="4" w:space="0" w:color="auto"/>
-          <w:right w:val="single" w:sz="4" w:space="0" w:color="auto"/>
-          <w:insideH w:val="single" w:sz="4" w:space="0" w:color="auto"/>
-          <w:insideV w:val="single" w:sz="4" w:space="0" w:color="auto"/>
+          <w:top w:val="single" w:color="auto" w:sz="4" w:space="0"/>
+          <w:left w:val="single" w:color="auto" w:sz="4" w:space="0"/>
+          <w:bottom w:val="single" w:color="auto" w:sz="4" w:space="0"/>
+          <w:right w:val="single" w:color="auto" w:sz="4" w:space="0"/>
+          <w:insideH w:val="single" w:color="auto" w:sz="4" w:space="0"/>
+          <w:insideV w:val="single" w:color="auto" w:sz="4" w:space="0"/>
         </w:tblBorders>
         <w:tblCellMar>
           <w:left w:w="10" w:type="dxa"/>
@@ -5194,12 +5474,12 @@
       <w:tblPr>
         <w:tblW w:w="5000" w:type="pct"/>
         <w:tblBorders>
-          <w:top w:val="single" w:sz="4" w:space="0" w:color="auto"/>
-          <w:left w:val="single" w:sz="4" w:space="0" w:color="auto"/>
-          <w:bottom w:val="single" w:sz="4" w:space="0" w:color="auto"/>
-          <w:right w:val="single" w:sz="4" w:space="0" w:color="auto"/>
-          <w:insideH w:val="single" w:sz="4" w:space="0" w:color="auto"/>
-          <w:insideV w:val="single" w:sz="4" w:space="0" w:color="auto"/>
+          <w:top w:val="single" w:color="auto" w:sz="4" w:space="0"/>
+          <w:left w:val="single" w:color="auto" w:sz="4" w:space="0"/>
+          <w:bottom w:val="single" w:color="auto" w:sz="4" w:space="0"/>
+          <w:right w:val="single" w:color="auto" w:sz="4" w:space="0"/>
+          <w:insideH w:val="single" w:color="auto" w:sz="4" w:space="0"/>
+          <w:insideV w:val="single" w:color="auto" w:sz="4" w:space="0"/>
         </w:tblBorders>
         <w:tblCellMar>
           <w:left w:w="10" w:type="dxa"/>
@@ -5690,7 +5970,7 @@
       </w:pPr>
       <w:r>
         <w:rPr>
-          <w:rFonts w:ascii="Courier New" w:eastAsia="Courier New" w:hAnsi="Courier New"/>
+          <w:rFonts w:ascii="Courier New" w:hAnsi="Courier New" w:eastAsia="Courier New"/>
         </w:rPr>
         <w:t xml:space="preserve">    pip install -r requirements.txt</w:t>
       </w:r>
@@ -5712,7 +5992,7 @@
       </w:pPr>
       <w:r>
         <w:rPr>
-          <w:rFonts w:ascii="Courier New" w:eastAsia="Courier New" w:hAnsi="Courier New"/>
+          <w:rFonts w:ascii="Courier New" w:hAnsi="Courier New" w:eastAsia="Courier New"/>
         </w:rPr>
         <w:t xml:space="preserve">    python train_model.py</w:t>
       </w:r>
@@ -5734,7 +6014,7 @@
       </w:pPr>
       <w:r>
         <w:rPr>
-          <w:rFonts w:ascii="Courier New" w:eastAsia="Courier New" w:hAnsi="Courier New"/>
+          <w:rFonts w:ascii="Courier New" w:hAnsi="Courier New" w:eastAsia="Courier New"/>
         </w:rPr>
         <w:t xml:space="preserve">    uvicorn app:app --reload</w:t>
       </w:r>
@@ -5764,7 +6044,7 @@
       </w:pPr>
       <w:r>
         <w:rPr>
-          <w:rFonts w:ascii="Courier New" w:eastAsia="Courier New" w:hAnsi="Courier New"/>
+          <w:rFonts w:ascii="Courier New" w:hAnsi="Courier New" w:eastAsia="Courier New"/>
         </w:rPr>
         <w:t xml:space="preserve">    streamlit run frontend.py</w:t>
       </w:r>
@@ -5801,12 +6081,12 @@
       <w:tblPr>
         <w:tblW w:w="5000" w:type="pct"/>
         <w:tblBorders>
-          <w:top w:val="single" w:sz="4" w:space="0" w:color="auto"/>
-          <w:left w:val="single" w:sz="4" w:space="0" w:color="auto"/>
-          <w:bottom w:val="single" w:sz="4" w:space="0" w:color="auto"/>
-          <w:right w:val="single" w:sz="4" w:space="0" w:color="auto"/>
-          <w:insideH w:val="single" w:sz="4" w:space="0" w:color="auto"/>
-          <w:insideV w:val="single" w:sz="4" w:space="0" w:color="auto"/>
+          <w:top w:val="single" w:color="auto" w:sz="4" w:space="0"/>
+          <w:left w:val="single" w:color="auto" w:sz="4" w:space="0"/>
+          <w:bottom w:val="single" w:color="auto" w:sz="4" w:space="0"/>
+          <w:right w:val="single" w:color="auto" w:sz="4" w:space="0"/>
+          <w:insideH w:val="single" w:color="auto" w:sz="4" w:space="0"/>
+          <w:insideV w:val="single" w:color="auto" w:sz="4" w:space="0"/>
         </w:tblBorders>
         <w:tblCellMar>
           <w:left w:w="10" w:type="dxa"/>
@@ -5978,12 +6258,12 @@
       <w:tblPr>
         <w:tblW w:w="5000" w:type="pct"/>
         <w:tblBorders>
-          <w:top w:val="single" w:sz="4" w:space="0" w:color="auto"/>
-          <w:left w:val="single" w:sz="4" w:space="0" w:color="auto"/>
-          <w:bottom w:val="single" w:sz="4" w:space="0" w:color="auto"/>
-          <w:right w:val="single" w:sz="4" w:space="0" w:color="auto"/>
-          <w:insideH w:val="single" w:sz="4" w:space="0" w:color="auto"/>
-          <w:insideV w:val="single" w:sz="4" w:space="0" w:color="auto"/>
+          <w:top w:val="single" w:color="auto" w:sz="4" w:space="0"/>
+          <w:left w:val="single" w:color="auto" w:sz="4" w:space="0"/>
+          <w:bottom w:val="single" w:color="auto" w:sz="4" w:space="0"/>
+          <w:right w:val="single" w:color="auto" w:sz="4" w:space="0"/>
+          <w:insideH w:val="single" w:color="auto" w:sz="4" w:space="0"/>
+          <w:insideV w:val="single" w:color="auto" w:sz="4" w:space="0"/>
         </w:tblBorders>
         <w:tblCellMar>
           <w:left w:w="10" w:type="dxa"/>
@@ -6421,7 +6701,7 @@
       </w:pPr>
       <w:r>
         <w:rPr>
-          <w:rFonts w:ascii="Courier New" w:eastAsia="Courier New" w:hAnsi="Courier New"/>
+          <w:rFonts w:ascii="Courier New" w:hAnsi="Courier New" w:eastAsia="Courier New"/>
         </w:rPr>
         <w:t>House_Price_Regression/</w:t>
       </w:r>
@@ -6432,7 +6712,7 @@
       </w:pPr>
       <w:r>
         <w:rPr>
-          <w:rFonts w:ascii="Courier New" w:eastAsia="Courier New" w:hAnsi="Courier New"/>
+          <w:rFonts w:ascii="Courier New" w:hAnsi="Courier New" w:eastAsia="Courier New"/>
         </w:rPr>
         <w:t>├── app.py                               # FastAPI backend</w:t>
       </w:r>
@@ -6443,7 +6723,7 @@
       </w:pPr>
       <w:r>
         <w:rPr>
-          <w:rFonts w:ascii="Courier New" w:eastAsia="Courier New" w:hAnsi="Courier New"/>
+          <w:rFonts w:ascii="Courier New" w:hAnsi="Courier New" w:eastAsia="Courier New"/>
         </w:rPr>
         <w:t>├── frontend.py                          # Streamlit frontend</w:t>
       </w:r>
@@ -6454,7 +6734,7 @@
       </w:pPr>
       <w:r>
         <w:rPr>
-          <w:rFonts w:ascii="Courier New" w:eastAsia="Courier New" w:hAnsi="Courier New"/>
+          <w:rFonts w:ascii="Courier New" w:hAnsi="Courier New" w:eastAsia="Courier New"/>
         </w:rPr>
         <w:t>├── train_model.py                       # Model training script</w:t>
       </w:r>
@@ -6465,7 +6745,7 @@
       </w:pPr>
       <w:r>
         <w:rPr>
-          <w:rFonts w:ascii="Courier New" w:eastAsia="Courier New" w:hAnsi="Courier New"/>
+          <w:rFonts w:ascii="Courier New" w:hAnsi="Courier New" w:eastAsia="Courier New"/>
         </w:rPr>
         <w:t>├── house_price_regression_dataset.csv   # Training dataset (1,000 rows)</w:t>
       </w:r>
@@ -6476,7 +6756,7 @@
       </w:pPr>
       <w:r>
         <w:rPr>
-          <w:rFonts w:ascii="Courier New" w:eastAsia="Courier New" w:hAnsi="Courier New"/>
+          <w:rFonts w:ascii="Courier New" w:hAnsi="Courier New" w:eastAsia="Courier New"/>
         </w:rPr>
         <w:t>├── requirements.txt                     # Python dependencies</w:t>
       </w:r>
@@ -6487,7 +6767,7 @@
       </w:pPr>
       <w:r>
         <w:rPr>
-          <w:rFonts w:ascii="Courier New" w:eastAsia="Courier New" w:hAnsi="Courier New"/>
+          <w:rFonts w:ascii="Courier New" w:hAnsi="Courier New" w:eastAsia="Courier New"/>
         </w:rPr>
         <w:t>├── README.md</w:t>
       </w:r>
@@ -6498,7 +6778,7 @@
       </w:pPr>
       <w:r>
         <w:rPr>
-          <w:rFonts w:ascii="Courier New" w:eastAsia="Courier New" w:hAnsi="Courier New"/>
+          <w:rFonts w:ascii="Courier New" w:hAnsi="Courier New" w:eastAsia="Courier New"/>
         </w:rPr>
         <w:t>├── model/</w:t>
       </w:r>
@@ -6509,7 +6789,7 @@
       </w:pPr>
       <w:r>
         <w:rPr>
-          <w:rFonts w:ascii="Courier New" w:eastAsia="Courier New" w:hAnsi="Courier New"/>
+          <w:rFonts w:ascii="Courier New" w:hAnsi="Courier New" w:eastAsia="Courier New"/>
         </w:rPr>
         <w:t>│   ├── model.pkl          # Saved best model (scikit-learn Pipeline)</w:t>
       </w:r>
@@ -6520,7 +6800,7 @@
       </w:pPr>
       <w:r>
         <w:rPr>
-          <w:rFonts w:ascii="Courier New" w:eastAsia="Courier New" w:hAnsi="Courier New"/>
+          <w:rFonts w:ascii="Courier New" w:hAnsi="Courier New" w:eastAsia="Courier New"/>
         </w:rPr>
         <w:t>│   └── meta.json          # Feature list, metrics, feature stats</w:t>
       </w:r>
@@ -6531,7 +6811,7 @@
       </w:pPr>
       <w:r>
         <w:rPr>
-          <w:rFonts w:ascii="Courier New" w:eastAsia="Courier New" w:hAnsi="Courier New"/>
+          <w:rFonts w:ascii="Courier New" w:hAnsi="Courier New" w:eastAsia="Courier New"/>
         </w:rPr>
         <w:t>└── plots/</w:t>
       </w:r>
@@ -6542,7 +6822,7 @@
       </w:pPr>
       <w:r>
         <w:rPr>
-          <w:rFonts w:ascii="Courier New" w:eastAsia="Courier New" w:hAnsi="Courier New"/>
+          <w:rFonts w:ascii="Courier New" w:hAnsi="Courier New" w:eastAsia="Courier New"/>
         </w:rPr>
         <w:t xml:space="preserve">    └── feature_importance.png   # Feature importance chart</w:t>
       </w:r>
@@ -6577,7 +6857,7 @@
       </w:pPr>
       <w:r>
         <w:rPr>
-          <w:rFonts w:ascii="Courier New" w:eastAsia="Courier New" w:hAnsi="Courier New"/>
+          <w:rFonts w:ascii="Courier New" w:hAnsi="Courier New" w:eastAsia="Courier New"/>
           <w:sz w:val="20"/>
         </w:rPr>
         <w:t>models = {</w:t>
@@ -6589,7 +6869,7 @@
       </w:pPr>
       <w:r>
         <w:rPr>
-          <w:rFonts w:ascii="Courier New" w:eastAsia="Courier New" w:hAnsi="Courier New"/>
+          <w:rFonts w:ascii="Courier New" w:hAnsi="Courier New" w:eastAsia="Courier New"/>
           <w:sz w:val="20"/>
         </w:rPr>
         <w:t xml:space="preserve">    "LinearRegression": Pipeline([</w:t>
@@ -6601,7 +6881,7 @@
       </w:pPr>
       <w:r>
         <w:rPr>
-          <w:rFonts w:ascii="Courier New" w:eastAsia="Courier New" w:hAnsi="Courier New"/>
+          <w:rFonts w:ascii="Courier New" w:hAnsi="Courier New" w:eastAsia="Courier New"/>
           <w:sz w:val="20"/>
         </w:rPr>
         <w:t xml:space="preserve">        ("scaler", StandardScaler()),</w:t>
@@ -6613,7 +6893,7 @@
       </w:pPr>
       <w:r>
         <w:rPr>
-          <w:rFonts w:ascii="Courier New" w:eastAsia="Courier New" w:hAnsi="Courier New"/>
+          <w:rFonts w:ascii="Courier New" w:hAnsi="Courier New" w:eastAsia="Courier New"/>
           <w:sz w:val="20"/>
         </w:rPr>
         <w:t xml:space="preserve">        ("model",  LinearRegression()),</w:t>
@@ -6625,7 +6905,7 @@
       </w:pPr>
       <w:r>
         <w:rPr>
-          <w:rFonts w:ascii="Courier New" w:eastAsia="Courier New" w:hAnsi="Courier New"/>
+          <w:rFonts w:ascii="Courier New" w:hAnsi="Courier New" w:eastAsia="Courier New"/>
           <w:sz w:val="20"/>
         </w:rPr>
         <w:t xml:space="preserve">    ]),</w:t>
@@ -6637,7 +6917,7 @@
       </w:pPr>
       <w:r>
         <w:rPr>
-          <w:rFonts w:ascii="Courier New" w:eastAsia="Courier New" w:hAnsi="Courier New"/>
+          <w:rFonts w:ascii="Courier New" w:hAnsi="Courier New" w:eastAsia="Courier New"/>
           <w:sz w:val="20"/>
         </w:rPr>
         <w:t xml:space="preserve">    "RandomForest": RandomForestRegressor(n_estimators=200, random_state=42),</w:t>
@@ -6649,7 +6929,7 @@
       </w:pPr>
       <w:r>
         <w:rPr>
-          <w:rFonts w:ascii="Courier New" w:eastAsia="Courier New" w:hAnsi="Courier New"/>
+          <w:rFonts w:ascii="Courier New" w:hAnsi="Courier New" w:eastAsia="Courier New"/>
           <w:sz w:val="20"/>
         </w:rPr>
         <w:t xml:space="preserve">    "GradientBoosting": GradientBoostingRegressor(n_estimators=300, learning_rate=0.05,</w:t>
@@ -6661,7 +6941,7 @@
       </w:pPr>
       <w:r>
         <w:rPr>
-          <w:rFonts w:ascii="Courier New" w:eastAsia="Courier New" w:hAnsi="Courier New"/>
+          <w:rFonts w:ascii="Courier New" w:hAnsi="Courier New" w:eastAsia="Courier New"/>
           <w:sz w:val="20"/>
         </w:rPr>
         <w:t xml:space="preserve">                                                   max_depth=5, random_state=42),</w:t>
@@ -6673,7 +6953,7 @@
       </w:pPr>
       <w:r>
         <w:rPr>
-          <w:rFonts w:ascii="Courier New" w:eastAsia="Courier New" w:hAnsi="Courier New"/>
+          <w:rFonts w:ascii="Courier New" w:hAnsi="Courier New" w:eastAsia="Courier New"/>
           <w:sz w:val="20"/>
         </w:rPr>
         <w:t>}</w:t>
@@ -6697,7 +6977,7 @@
       </w:pPr>
       <w:r>
         <w:rPr>
-          <w:rFonts w:ascii="Courier New" w:eastAsia="Courier New" w:hAnsi="Courier New"/>
+          <w:rFonts w:ascii="Courier New" w:hAnsi="Courier New" w:eastAsia="Courier New"/>
           <w:sz w:val="20"/>
         </w:rPr>
         <w:t>@app.post("/predict", response_model=PredictionResponse)</w:t>
@@ -6709,7 +6989,7 @@
       </w:pPr>
       <w:r>
         <w:rPr>
-          <w:rFonts w:ascii="Courier New" w:eastAsia="Courier New" w:hAnsi="Courier New"/>
+          <w:rFonts w:ascii="Courier New" w:hAnsi="Courier New" w:eastAsia="Courier New"/>
           <w:sz w:val="20"/>
         </w:rPr>
         <w:t>def predict(house: HouseFeatures):</w:t>
@@ -6721,7 +7001,7 @@
       </w:pPr>
       <w:r>
         <w:rPr>
-          <w:rFonts w:ascii="Courier New" w:eastAsia="Courier New" w:hAnsi="Courier New"/>
+          <w:rFonts w:ascii="Courier New" w:hAnsi="Courier New" w:eastAsia="Courier New"/>
           <w:sz w:val="20"/>
         </w:rPr>
         <w:t xml:space="preserve">    input_df = pd.DataFrame([[</w:t>
@@ -6733,7 +7013,7 @@
       </w:pPr>
       <w:r>
         <w:rPr>
-          <w:rFonts w:ascii="Courier New" w:eastAsia="Courier New" w:hAnsi="Courier New"/>
+          <w:rFonts w:ascii="Courier New" w:hAnsi="Courier New" w:eastAsia="Courier New"/>
           <w:sz w:val="20"/>
         </w:rPr>
         <w:t xml:space="preserve">        house.Square_Footage, house.Num_Bedrooms, house.Num_Bathrooms,</w:t>
@@ -6745,7 +7025,7 @@
       </w:pPr>
       <w:r>
         <w:rPr>
-          <w:rFonts w:ascii="Courier New" w:eastAsia="Courier New" w:hAnsi="Courier New"/>
+          <w:rFonts w:ascii="Courier New" w:hAnsi="Courier New" w:eastAsia="Courier New"/>
           <w:sz w:val="20"/>
         </w:rPr>
         <w:t xml:space="preserve">        house.Year_Built, house.Lot_Size, house.Garage_Size,</w:t>
@@ -6757,7 +7037,7 @@
       </w:pPr>
       <w:r>
         <w:rPr>
-          <w:rFonts w:ascii="Courier New" w:eastAsia="Courier New" w:hAnsi="Courier New"/>
+          <w:rFonts w:ascii="Courier New" w:hAnsi="Courier New" w:eastAsia="Courier New"/>
           <w:sz w:val="20"/>
         </w:rPr>
         <w:t xml:space="preserve">        house.Neighborhood_Quality,</w:t>
@@ -6769,7 +7049,7 @@
       </w:pPr>
       <w:r>
         <w:rPr>
-          <w:rFonts w:ascii="Courier New" w:eastAsia="Courier New" w:hAnsi="Courier New"/>
+          <w:rFonts w:ascii="Courier New" w:hAnsi="Courier New" w:eastAsia="Courier New"/>
           <w:sz w:val="20"/>
         </w:rPr>
         <w:t xml:space="preserve">    ]], columns=FEATURES)</w:t>
@@ -6781,7 +7061,7 @@
       </w:pPr>
       <w:r>
         <w:rPr>
-          <w:rFonts w:ascii="Courier New" w:eastAsia="Courier New" w:hAnsi="Courier New"/>
+          <w:rFonts w:ascii="Courier New" w:hAnsi="Courier New" w:eastAsia="Courier New"/>
           <w:sz w:val="20"/>
         </w:rPr>
         <w:t xml:space="preserve">    price = float(model.predict(input_df)[0])</w:t>
@@ -6793,7 +7073,7 @@
       </w:pPr>
       <w:r>
         <w:rPr>
-          <w:rFonts w:ascii="Courier New" w:eastAsia="Courier New" w:hAnsi="Courier New"/>
+          <w:rFonts w:ascii="Courier New" w:hAnsi="Courier New" w:eastAsia="Courier New"/>
           <w:sz w:val="20"/>
         </w:rPr>
         <w:t xml:space="preserve">    return PredictionResponse(predicted_price=round(price, 2), model_used=meta["model_name"])</w:t>
@@ -6817,7 +7097,7 @@
       </w:pPr>
       <w:r>
         <w:rPr>
-          <w:rFonts w:ascii="Courier New" w:eastAsia="Courier New" w:hAnsi="Courier New"/>
+          <w:rFonts w:ascii="Courier New" w:hAnsi="Courier New" w:eastAsia="Courier New"/>
           <w:sz w:val="20"/>
         </w:rPr>
         <w:t>payload = {</w:t>
@@ -6829,7 +7109,7 @@
       </w:pPr>
       <w:r>
         <w:rPr>
-          <w:rFonts w:ascii="Courier New" w:eastAsia="Courier New" w:hAnsi="Courier New"/>
+          <w:rFonts w:ascii="Courier New" w:hAnsi="Courier New" w:eastAsia="Courier New"/>
           <w:sz w:val="20"/>
         </w:rPr>
         <w:t xml:space="preserve">    "Square_Footage": square_footage, "Num_Bedrooms": num_bedrooms,</w:t>
@@ -6841,7 +7121,7 @@
       </w:pPr>
       <w:r>
         <w:rPr>
-          <w:rFonts w:ascii="Courier New" w:eastAsia="Courier New" w:hAnsi="Courier New"/>
+          <w:rFonts w:ascii="Courier New" w:hAnsi="Courier New" w:eastAsia="Courier New"/>
           <w:sz w:val="20"/>
         </w:rPr>
         <w:t xml:space="preserve">    "Num_Bathrooms": num_bathrooms, "Year_Built": year_built,</w:t>
@@ -6853,7 +7133,7 @@
       </w:pPr>
       <w:r>
         <w:rPr>
-          <w:rFonts w:ascii="Courier New" w:eastAsia="Courier New" w:hAnsi="Courier New"/>
+          <w:rFonts w:ascii="Courier New" w:hAnsi="Courier New" w:eastAsia="Courier New"/>
           <w:sz w:val="20"/>
         </w:rPr>
         <w:t xml:space="preserve">    "Lot_Size": lot_size, "Garage_Size": garage_size,</w:t>
@@ -6865,7 +7145,7 @@
       </w:pPr>
       <w:r>
         <w:rPr>
-          <w:rFonts w:ascii="Courier New" w:eastAsia="Courier New" w:hAnsi="Courier New"/>
+          <w:rFonts w:ascii="Courier New" w:hAnsi="Courier New" w:eastAsia="Courier New"/>
           <w:sz w:val="20"/>
         </w:rPr>
         <w:t xml:space="preserve">    "Neighborhood_Quality": neighborhood_quality,</w:t>
@@ -6877,7 +7157,7 @@
       </w:pPr>
       <w:r>
         <w:rPr>
-          <w:rFonts w:ascii="Courier New" w:eastAsia="Courier New" w:hAnsi="Courier New"/>
+          <w:rFonts w:ascii="Courier New" w:hAnsi="Courier New" w:eastAsia="Courier New"/>
           <w:sz w:val="20"/>
         </w:rPr>
         <w:t>}</w:t>
@@ -6889,7 +7169,7 @@
       </w:pPr>
       <w:r>
         <w:rPr>
-          <w:rFonts w:ascii="Courier New" w:eastAsia="Courier New" w:hAnsi="Courier New"/>
+          <w:rFonts w:ascii="Courier New" w:hAnsi="Courier New" w:eastAsia="Courier New"/>
           <w:sz w:val="20"/>
         </w:rPr>
         <w:t>result = requests.post("http://localhost:8000/predict", json=payload).json()</w:t>
@@ -6901,7 +7181,7 @@
       </w:pPr>
       <w:r>
         <w:rPr>
-          <w:rFonts w:ascii="Courier New" w:eastAsia="Courier New" w:hAnsi="Courier New"/>
+          <w:rFonts w:ascii="Courier New" w:hAnsi="Courier New" w:eastAsia="Courier New"/>
           <w:sz w:val="20"/>
         </w:rPr>
         <w:t>price = result["predicted_price"]</w:t>
@@ -6921,7 +7201,7 @@
   <w:docDefaults>
     <w:rPrDefault>
       <w:rPr>
-        <w:rFonts w:ascii="Calibri" w:eastAsia="Times New Roman" w:hAnsi="Calibri" w:cs="Times New Roman"/>
+        <w:rFonts w:ascii="Calibri" w:hAnsi="Calibri" w:eastAsia="Times New Roman" w:cs="Times New Roman"/>
         <w:sz w:val="22"/>
         <w:szCs w:val="22"/>
         <w:lang w:val="en-IN" w:eastAsia="en-IN" w:bidi="ar-SA"/>
@@ -6932,14 +7212,14 @@
   <w:latentStyles w:defLockedState="0" w:defUIPriority="99" w:defSemiHidden="0" w:defUnhideWhenUsed="0" w:defQFormat="0" w:count="376">
     <w:lsdException w:name="Normal" w:uiPriority="0" w:qFormat="1"/>
     <w:lsdException w:name="heading 1" w:uiPriority="9" w:qFormat="1"/>
-    <w:lsdException w:name="heading 2" w:semiHidden="1" w:uiPriority="9" w:unhideWhenUsed="1" w:qFormat="1"/>
-    <w:lsdException w:name="heading 3" w:semiHidden="1" w:uiPriority="9" w:unhideWhenUsed="1" w:qFormat="1"/>
-    <w:lsdException w:name="heading 4" w:semiHidden="1" w:uiPriority="9" w:unhideWhenUsed="1" w:qFormat="1"/>
-    <w:lsdException w:name="heading 5" w:semiHidden="1" w:uiPriority="9" w:unhideWhenUsed="1" w:qFormat="1"/>
-    <w:lsdException w:name="heading 6" w:semiHidden="1" w:uiPriority="9" w:unhideWhenUsed="1" w:qFormat="1"/>
-    <w:lsdException w:name="heading 7" w:semiHidden="1" w:uiPriority="9" w:unhideWhenUsed="1" w:qFormat="1"/>
-    <w:lsdException w:name="heading 8" w:semiHidden="1" w:uiPriority="9" w:unhideWhenUsed="1" w:qFormat="1"/>
-    <w:lsdException w:name="heading 9" w:semiHidden="1" w:uiPriority="9" w:unhideWhenUsed="1" w:qFormat="1"/>
+    <w:lsdException w:name="heading 2" w:uiPriority="9" w:semiHidden="1" w:unhideWhenUsed="1" w:qFormat="1"/>
+    <w:lsdException w:name="heading 3" w:uiPriority="9" w:semiHidden="1" w:unhideWhenUsed="1" w:qFormat="1"/>
+    <w:lsdException w:name="heading 4" w:uiPriority="9" w:semiHidden="1" w:unhideWhenUsed="1" w:qFormat="1"/>
+    <w:lsdException w:name="heading 5" w:uiPriority="9" w:semiHidden="1" w:unhideWhenUsed="1" w:qFormat="1"/>
+    <w:lsdException w:name="heading 6" w:uiPriority="9" w:semiHidden="1" w:unhideWhenUsed="1" w:qFormat="1"/>
+    <w:lsdException w:name="heading 7" w:uiPriority="9" w:semiHidden="1" w:unhideWhenUsed="1" w:qFormat="1"/>
+    <w:lsdException w:name="heading 8" w:uiPriority="9" w:semiHidden="1" w:unhideWhenUsed="1" w:qFormat="1"/>
+    <w:lsdException w:name="heading 9" w:uiPriority="9" w:semiHidden="1" w:unhideWhenUsed="1" w:qFormat="1"/>
     <w:lsdException w:name="index 1" w:semiHidden="1" w:unhideWhenUsed="1"/>
     <w:lsdException w:name="index 2" w:semiHidden="1" w:unhideWhenUsed="1"/>
     <w:lsdException w:name="index 3" w:semiHidden="1" w:unhideWhenUsed="1"/>
@@ -6949,22 +7229,22 @@
     <w:lsdException w:name="index 7" w:semiHidden="1" w:unhideWhenUsed="1"/>
     <w:lsdException w:name="index 8" w:semiHidden="1" w:unhideWhenUsed="1"/>
     <w:lsdException w:name="index 9" w:semiHidden="1" w:unhideWhenUsed="1"/>
-    <w:lsdException w:name="toc 1" w:semiHidden="1" w:uiPriority="39" w:unhideWhenUsed="1"/>
-    <w:lsdException w:name="toc 2" w:semiHidden="1" w:uiPriority="39" w:unhideWhenUsed="1"/>
-    <w:lsdException w:name="toc 3" w:semiHidden="1" w:uiPriority="39" w:unhideWhenUsed="1"/>
-    <w:lsdException w:name="toc 4" w:semiHidden="1" w:uiPriority="39" w:unhideWhenUsed="1"/>
-    <w:lsdException w:name="toc 5" w:semiHidden="1" w:uiPriority="39" w:unhideWhenUsed="1"/>
-    <w:lsdException w:name="toc 6" w:semiHidden="1" w:uiPriority="39" w:unhideWhenUsed="1"/>
-    <w:lsdException w:name="toc 7" w:semiHidden="1" w:uiPriority="39" w:unhideWhenUsed="1"/>
-    <w:lsdException w:name="toc 8" w:semiHidden="1" w:uiPriority="39" w:unhideWhenUsed="1"/>
-    <w:lsdException w:name="toc 9" w:semiHidden="1" w:uiPriority="39" w:unhideWhenUsed="1"/>
+    <w:lsdException w:name="toc 1" w:uiPriority="39" w:semiHidden="1" w:unhideWhenUsed="1"/>
+    <w:lsdException w:name="toc 2" w:uiPriority="39" w:semiHidden="1" w:unhideWhenUsed="1"/>
+    <w:lsdException w:name="toc 3" w:uiPriority="39" w:semiHidden="1" w:unhideWhenUsed="1"/>
+    <w:lsdException w:name="toc 4" w:uiPriority="39" w:semiHidden="1" w:unhideWhenUsed="1"/>
+    <w:lsdException w:name="toc 5" w:uiPriority="39" w:semiHidden="1" w:unhideWhenUsed="1"/>
+    <w:lsdException w:name="toc 6" w:uiPriority="39" w:semiHidden="1" w:unhideWhenUsed="1"/>
+    <w:lsdException w:name="toc 7" w:uiPriority="39" w:semiHidden="1" w:unhideWhenUsed="1"/>
+    <w:lsdException w:name="toc 8" w:uiPriority="39" w:semiHidden="1" w:unhideWhenUsed="1"/>
+    <w:lsdException w:name="toc 9" w:uiPriority="39" w:semiHidden="1" w:unhideWhenUsed="1"/>
     <w:lsdException w:name="Normal Indent" w:semiHidden="1" w:unhideWhenUsed="1"/>
     <w:lsdException w:name="footnote text" w:semiHidden="1" w:unhideWhenUsed="1"/>
     <w:lsdException w:name="annotation text" w:semiHidden="1" w:unhideWhenUsed="1"/>
     <w:lsdException w:name="header" w:semiHidden="1" w:unhideWhenUsed="1"/>
     <w:lsdException w:name="footer" w:semiHidden="1" w:unhideWhenUsed="1"/>
     <w:lsdException w:name="index heading" w:semiHidden="1" w:unhideWhenUsed="1"/>
-    <w:lsdException w:name="caption" w:semiHidden="1" w:uiPriority="35" w:unhideWhenUsed="1" w:qFormat="1"/>
+    <w:lsdException w:name="caption" w:uiPriority="35" w:semiHidden="1" w:unhideWhenUsed="1" w:qFormat="1"/>
     <w:lsdException w:name="table of figures" w:semiHidden="1" w:unhideWhenUsed="1"/>
     <w:lsdException w:name="envelope address" w:semiHidden="1" w:unhideWhenUsed="1"/>
     <w:lsdException w:name="envelope return" w:semiHidden="1" w:unhideWhenUsed="1"/>
@@ -6995,7 +7275,7 @@
     <w:lsdException w:name="Title" w:uiPriority="10" w:qFormat="1"/>
     <w:lsdException w:name="Closing" w:semiHidden="1" w:unhideWhenUsed="1"/>
     <w:lsdException w:name="Signature" w:semiHidden="1" w:unhideWhenUsed="1"/>
-    <w:lsdException w:name="Default Paragraph Font" w:semiHidden="1" w:uiPriority="1" w:unhideWhenUsed="1"/>
+    <w:lsdException w:name="Default Paragraph Font" w:uiPriority="1" w:semiHidden="1" w:unhideWhenUsed="1"/>
     <w:lsdException w:name="Body Text" w:semiHidden="1" w:unhideWhenUsed="1"/>
     <w:lsdException w:name="Body Text Indent" w:semiHidden="1" w:unhideWhenUsed="1"/>
     <w:lsdException w:name="List Continue" w:semiHidden="1" w:unhideWhenUsed="1"/>
@@ -7195,8 +7475,8 @@
     <w:lsdException w:name="Subtle Reference" w:uiPriority="31" w:qFormat="1"/>
     <w:lsdException w:name="Intense Reference" w:uiPriority="32" w:qFormat="1"/>
     <w:lsdException w:name="Book Title" w:uiPriority="33" w:qFormat="1"/>
-    <w:lsdException w:name="Bibliography" w:semiHidden="1" w:uiPriority="37" w:unhideWhenUsed="1"/>
-    <w:lsdException w:name="TOC Heading" w:semiHidden="1" w:uiPriority="39" w:unhideWhenUsed="1" w:qFormat="1"/>
+    <w:lsdException w:name="Bibliography" w:uiPriority="37" w:semiHidden="1" w:unhideWhenUsed="1"/>
+    <w:lsdException w:name="TOC Heading" w:uiPriority="39" w:semiHidden="1" w:unhideWhenUsed="1" w:qFormat="1"/>
     <w:lsdException w:name="Plain Table 1" w:uiPriority="41"/>
     <w:lsdException w:name="Plain Table 2" w:uiPriority="42"/>
     <w:lsdException w:name="Plain Table 3" w:uiPriority="43"/>
@@ -7307,20 +7587,20 @@
     <w:lsdException w:name="Unresolved Mention" w:semiHidden="1" w:unhideWhenUsed="1"/>
     <w:lsdException w:name="Smart Link" w:semiHidden="1" w:unhideWhenUsed="1"/>
   </w:latentStyles>
-  <w:style w:type="paragraph" w:default="1" w:styleId="Normal">
+  <w:style w:type="paragraph" w:styleId="Normal" w:default="1">
     <w:name w:val="Normal"/>
     <w:qFormat/>
     <w:pPr>
       <w:spacing w:line="259" w:lineRule="auto"/>
     </w:pPr>
   </w:style>
-  <w:style w:type="character" w:default="1" w:styleId="DefaultParagraphFont">
+  <w:style w:type="character" w:styleId="DefaultParagraphFont" w:default="1">
     <w:name w:val="Default Paragraph Font"/>
     <w:uiPriority w:val="1"/>
     <w:semiHidden/>
     <w:unhideWhenUsed/>
   </w:style>
-  <w:style w:type="table" w:default="1" w:styleId="TableNormal">
+  <w:style w:type="table" w:styleId="TableNormal" w:default="1">
     <w:name w:val="Normal Table"/>
     <w:uiPriority w:val="99"/>
     <w:semiHidden/>
@@ -7335,7 +7615,7 @@
       </w:tblCellMar>
     </w:tblPr>
   </w:style>
-  <w:style w:type="numbering" w:default="1" w:styleId="NoList">
+  <w:style w:type="numbering" w:styleId="NoList" w:default="1">
     <w:name w:val="No List"/>
     <w:uiPriority w:val="99"/>
     <w:semiHidden/>

</xml_diff>